<commit_message>
Prepare v1.0.1 final figure and documentation update
</commit_message>
<xml_diff>
--- a/tables/Supplementary_Table_1_CODEX_Markers.docx
+++ b/tables/Supplementary_Table_1_CODEX_Markers.docx
@@ -3701,7 +3701,7 @@
                 <w:b w:val="0"/>
                 <w:sz w:val="18"/>
               </w:rPr>
-              <w:t>Origene</w:t>
+              <w:t xml:space="preserve">OriGene</w:t>
             </w:r>
           </w:p>
         </w:tc>
@@ -8849,13 +8849,18 @@
               <w:keepNext w:val="0"/>
               <w:spacing w:after="0" w:line="240" w:lineRule="auto"/>
             </w:pPr>
-            <w:r>
-              <w:rPr>
-                <w:rFonts w:ascii="Arial" w:hAnsi="Arial"/>
-                <w:b w:val="0"/>
-                <w:sz w:val="18"/>
-              </w:rPr>
-              <w:t>C31.3 + C31.7 + C31.10)</w:t>
+            <w:commentRangeStart w:id="0"/>
+            <w:r>
+              <w:rPr>
+                <w:rFonts w:ascii="Arial" w:hAnsi="Arial"/>
+                <w:b w:val="0"/>
+                <w:sz w:val="18"/>
+              </w:rPr>
+              <w:t xml:space="preserve">C31.3 + C31.7 + C31.10</w:t>
+            </w:r>
+            <w:commentRangeEnd w:id="0"/>
+            <w:r>
+              <w:commentReference w:id="0"/>
             </w:r>
           </w:p>
         </w:tc>
@@ -13437,11 +13442,16 @@
       <w:pPr>
         <w:spacing w:before="120"/>
       </w:pPr>
+      <w:commentRangeStart w:id="1"/>
       <w:r>
         <w:t>Oligo, oligonucleotide barcode identifier; ms, milliseconds. DAPI (BD Pharmingen, 564907) was used at 1:300. Run-specific dilution codes for CD194 and CD163 are retained from the assay worksheet. The α5β1 reagent was clone M200 (Volociximab), rabbit IgG chimeric (Abcam, ab275977).</w:t>
       </w:r>
       <w:r>
         <w:t xml:space="preserve"> —, not specified: the CD274 acquisition cycle could not be resolved from the source worksheet; CD4 was confirmed in cycle 4.</w:t>
+      </w:r>
+      <w:commentRangeEnd w:id="1"/>
+      <w:r>
+        <w:commentReference w:id="1"/>
       </w:r>
     </w:p>
     <w:sectPr>
@@ -13452,6 +13462,25 @@
     </w:sectPr>
   </w:body>
 </w:document>
+</file>
+
+<file path=word/comments.xml><?xml version="1.0" encoding="utf-8"?>
+<w:comments xmlns:w="http://schemas.openxmlformats.org/wordprocessingml/2006/main">
+  <w:comment w:id="0" w:author="Editorial review" w:date="2026-09-21T19:00:00Z">
+    <w:p>
+      <w:r>
+        <w:t>Editorial correction: removed an unmatched closing parenthesis from the CD31 clone entry. OriGene capitalization was also corrected.</w:t>
+      </w:r>
+    </w:p>
+  </w:comment>
+  <w:comment w:id="1" w:author="Editorial review" w:date="2026-09-21T19:00:00Z">
+    <w:p>
+      <w:r>
+        <w:t>Author review needed: the CD274 acquisition cycle remains unconfirmed. CD4 is confirmed in cycle 4. Original run-specific dilution codes remain unchanged.</w:t>
+      </w:r>
+    </w:p>
+  </w:comment>
+</w:comments>
 </file>
 
 <file path=word/numbering.xml><?xml version="1.0" encoding="utf-8"?>

</xml_diff>